<commit_message>
docs: atualiza artigo técnico Metodologia_e_Operacao_Coletores.docx com os novos scripts do pipeline
- Adiciona a Seção 9 detalhando os scripts consolidar_triagem.py, executar_triagem_e_extracao.py e gerar_sintese_final.py
- Atualiza o script gerador generate_docx_report.py
</commit_message>
<xml_diff>
--- a/Metodologia_e_Operacao_Coletores.docx
+++ b/Metodologia_e_Operacao_Coletores.docx
@@ -475,7 +475,63 @@
           <w:b/>
           <w:sz w:val="28"/>
         </w:rPr>
-        <w:t>9. Como Operar o Sistema Localmente</w:t>
+        <w:t>9. Pipeline de Consolidação, Deduplicação e Análise Estatística</w:t>
+      </w:r>
+    </w:p>
+    <w:p>
+      <w:pPr>
+        <w:spacing w:after="120" w:line="360" w:lineRule="auto"/>
+        <w:ind w:firstLine="706"/>
+        <w:jc w:val="both"/>
+      </w:pPr>
+      <w:r>
+        <w:rPr>
+          <w:rFonts w:ascii="Times New Roman" w:hAnsi="Times New Roman"/>
+          <w:sz w:val="24"/>
+        </w:rPr>
+        <w:t>A fase de execução pós-coleta é sustentada por três ferramentas automatizadas que operacionalizam a triagem, extração de dados e a síntese final. O script de consolidação (consolidar_triagem.py) lê os arquivos CSV de saída de todos os coletores e unifica os registros em um único formato tabular. Em seguida, executa uma deduplicação em duas fases: primeiro, por correspondência exata do DOI normalizado; segundo, por similaridade difusa baseada no algoritmo SequenceMatcher (com limite de aceitação de 90%) nos títulos para registros que não contêm o DOI. O script também realiza uma pré-triagem automática eliminando trabalhos fora do recorte temporal ou em idiomas não elegíveis (permitindo por padrão inglês, português e espanhol), popula a aba 'Planilha Triagem' do formulário Excel e atualiza a aba 'PRISMA Flow' com os números do fluxo inicial.</w:t>
+      </w:r>
+    </w:p>
+    <w:p>
+      <w:pPr>
+        <w:spacing w:after="120" w:line="360" w:lineRule="auto"/>
+        <w:ind w:firstLine="706"/>
+        <w:jc w:val="both"/>
+      </w:pPr>
+      <w:r>
+        <w:rPr>
+          <w:rFonts w:ascii="Times New Roman" w:hAnsi="Times New Roman"/>
+          <w:sz w:val="24"/>
+        </w:rPr>
+        <w:t>O processo de seleção final e sistematização das evidências é realizado pelo script de simulação e triagem (executar_triagem_e_extracao.py). Esta ferramenta simula decisões em dupla independente de revisão (Revisor A e Revisor B) tanto para a triagem por título e resumo (T/R) quanto para a triagem por texto completo (TC), preenchendo as justificativas e calculando os conflitos metodológicos diretamente na planilha Excel. Para os estudos aprovados, o script extrai automaticamente metadados estruturados (autor, ano, base, DOI, título, periódico, resumo, objetivos, desenho do estudo, tamanho da amostra, métodos estatísticos/algoritmos causais, limitações e dados geográficos) e os escreve na 'Planilha Extração', enquanto avalia os riscos de viés (ROB 2/ROBINS-I) na 'Planilha Qualidade', atualizando por fim os campos finais do fluxograma PRISMA.</w:t>
+      </w:r>
+    </w:p>
+    <w:p>
+      <w:pPr>
+        <w:spacing w:after="120" w:line="360" w:lineRule="auto"/>
+        <w:ind w:firstLine="706"/>
+        <w:jc w:val="both"/>
+      </w:pPr>
+      <w:r>
+        <w:rPr>
+          <w:rFonts w:ascii="Times New Roman" w:hAnsi="Times New Roman"/>
+          <w:sz w:val="24"/>
+        </w:rPr>
+        <w:t>Por fim, o script de análise e síntese (gerar_sintese_final.py) processa os dados finais extraídos no Excel para realizar estatísticas descritivas automáticas do levantamento bibliométrico. A ferramenta compila a distribuição temporal da literatura, a tipologia dos desenhos de estudo, a frequência de uso de métodos de descoberta e inferência causal, os níveis de risco de viés avaliados, as limitações metodológicas reportadas e a distribuição geográfica das publicações. Ao término da análise, o script consolida os dados estruturados em tabelas formatadas em Markdown, gerando o relatório final completo de síntese de evidências (relatorio_sintese_final.md) para documentar as conclusões da revisão.</w:t>
+      </w:r>
+    </w:p>
+    <w:p>
+      <w:pPr>
+        <w:keepNext/>
+        <w:spacing w:before="240" w:after="120"/>
+      </w:pPr>
+      <w:r>
+        <w:rPr>
+          <w:rFonts w:ascii="Times New Roman" w:hAnsi="Times New Roman"/>
+          <w:b/>
+          <w:sz w:val="28"/>
+        </w:rPr>
+        <w:t>10. Como Operar o Sistema Localmente</w:t>
       </w:r>
     </w:p>
     <w:p>
@@ -503,7 +559,7 @@
           <w:rFonts w:ascii="Times New Roman" w:hAnsi="Times New Roman"/>
           <w:sz w:val="24"/>
         </w:rPr>
-        <w:t>O terminal exibirá em tempo real o andamento da paginação da busca, o status da coleta e as etapas de enriquecimento de resumos. Ao término do processamento, as pastas específicas de saída (ex: scielo_outputs, scopus_outputs e openalex_outputs) serão criadas e populadas no mesmo diretório. As planilhas geradas possuem recursos de formatação automática que ajustam a largura das colunas e habilitam a quebra de texto nas células dos resumos. Recomenda-se abrir diretamente o arquivo de relatório Markdown gerado para obter uma visão geral das publicações.</w:t>
+        <w:t>O terminal exibirá em tempo real o andamento da paginação da busca, o status da coleta e as etapas de enriquecimento de resumos. Ao término do processamento, as pastas específicas de saída (ex: scielo_outputs, scopus_outputs e openalex_outputs) serão criadas e populadas no mesmo diretório. Em seguida, o pipeline de consolidação, triagem e síntese pode ser acionado sequencialmente (consolidar_triagem.py, executar_triagem_e_extracao.py e gerar_sintese_final.py) para gerar as planilhas consolidadas e o relatório de síntese narrativa. As planilhas geradas possuem recursos de formatação automática que ajustam a largura das colunas e habilitam a quebra de texto nas células.</w:t>
       </w:r>
     </w:p>
     <w:p>
@@ -517,7 +573,7 @@
           <w:b/>
           <w:sz w:val="28"/>
         </w:rPr>
-        <w:t>10. Conclusão</w:t>
+        <w:t>11. Conclusão</w:t>
       </w:r>
     </w:p>
     <w:p>
@@ -531,7 +587,7 @@
           <w:rFonts w:ascii="Times New Roman" w:hAnsi="Times New Roman"/>
           <w:sz w:val="24"/>
         </w:rPr>
-        <w:t>O desenvolvimento da suite de coletores científicos integrada ao desenho de pesquisa em Excel resolveu os gargalos críticos enfrentados na condução de revisões sistemáticas do projeto de pesquisa atual. A união entre o planejamento metodológico estruturado em Excel, o motor de enriquecimento híbrido de dados em Python e as planilhas de gestão operacionais do protocolo proveu um fluxo de trabalho extremamente eficiente e reprodutível. A automação das configurações reduziu a barreira técnica para os pesquisadores, eliminando erros humanos de parametrização.</w:t>
+        <w:t>O desenvolvimento da suite de coletores científicos integrada ao desenho de pesquisa em Excel resolveu os gargalos críticos enfrentados na condução de revisões sistemáticas do projeto de pesquisa atual. A união entre o planejamento metodológico estruturado em Excel, o motor de enriquecimento híbrido de dados em Python, os scripts de deduplicação e triagem automatizados e as planilhas de gestão operacionais do protocolo proveu um fluxo de trabalho extremamente eficiente e reprodutível. A automação das configurações reduziu a barreira técnica para os pesquisadores, eliminando erros humanos de parametrização.</w:t>
       </w:r>
     </w:p>
     <w:p>
@@ -559,7 +615,7 @@
           <w:b/>
           <w:sz w:val="28"/>
         </w:rPr>
-        <w:t>11. Referências Bibliográficas</w:t>
+        <w:t>12. Referências Bibliográficas</w:t>
       </w:r>
     </w:p>
     <w:p>

</xml_diff>